<commit_message>
Release v2.7.0: Split background service and Flet dashboard client with IPC sockets
</commit_message>
<xml_diff>
--- a/docs/System_Resource_Optimizer_Documentation.docx
+++ b/docs/System_Resource_Optimizer_Documentation.docx
@@ -6581,7 +6581,7 @@
         <w:spacing w:before="0" w:after="120" w:line="276" w:lineRule="auto"/>
       </w:pPr>
       <w:r>
-        <w:t>This document describes the architecture and implementation of three tightly coupled modules: `src/core/pipeline.py`, which orchestrates the end-to-end inference loop; `src/core/action_engine.py`, which manages the lifecycle of process suspensions; and `src/core/notifier.py`, which dispatches non-blocking Windows/macOS Toast alerts. Together, these modules translate AI predictions into concrete, reversible system interventions.</w:t>
+        <w:t>This document describes the architecture and implementation of four decoupled modules: `src/optimizer_service.py` which runs as a background service; `src/core/pipeline.py`, which orchestrates the end-to-end inference loop; `src/core/action_engine.py`, which manages the lifecycle of process suspensions; and `src/core/notifier.py`, which dispatches non-blocking Windows/macOS Toast alerts. Together, these modules translate AI predictions into concrete, reversible system interventions.</w:t>
       </w:r>
     </w:p>
     <w:p>
@@ -6826,7 +6826,7 @@
         <w:spacing w:before="0" w:after="120" w:line="276" w:lineRule="auto"/>
       </w:pPr>
       <w:r>
-        <w:t>The pipeline thread communicates results to the Flet dashboard via an `on_result` callback — a function reference passed at construction time. This callback is invoked on the pipeline thread, putting results into a thread-safe Queue. The Flet UI consumes these results asynchronously using a background polling thread and updates the UI on the main thread event loop via Flet's asynchronous pipeline. This separation ensures that a slow UI render never blocks the pipeline loop.</w:t>
+        <w:t>The pipeline thread communicates results to the local IPC handler in the background service, which caches the latest telemetry sample and maintains a rolling history. The Flet dashboard in `src/dashboard.py` connects to this background service via local TCP sockets (IPC on port 5050) and polls for updates asynchronously. This socket communication ensures that the dashboard can be opened and closed at any time without impacting the telemetry pipeline or automated process optimizations.</w:t>
       </w:r>
     </w:p>
     <w:tbl>
@@ -7200,7 +7200,7 @@
           </w:tcPr>
           <w:p>
             <w:r>
-              <w:t>Pipeline → Thread-safe Queue &amp; Flet Async Task</w:t>
+              <w:t>Pipeline → IPC TCP Sockets (Port 5050) &amp; Flet Async Task</w:t>
             </w:r>
           </w:p>
         </w:tc>
@@ -8925,7 +8925,7 @@
         <w:spacing w:before="0" w:after="120" w:line="276" w:lineRule="auto"/>
       </w:pPr>
       <w:r>
-        <w:t>The dashboard is implemented in `src/main.py` and communicates with the background telemetry pipeline via a thread-safe Queue and Flet's asynchronous event update loop. It was designed to satisfy three core engineering principles:</w:t>
+        <w:t>The dashboard is implemented in `src/dashboard.py` and communicates with the background optimizer service (`src/optimizer_service.py`) via a local IPC TCP socket connection and Flet's asynchronous event update loop. It was designed to satisfy three core engineering principles:</w:t>
       </w:r>
     </w:p>
     <w:p>
@@ -9779,7 +9779,7 @@
         <w:spacing w:before="0" w:after="120" w:line="276" w:lineRule="auto"/>
       </w:pPr>
       <w:r>
-        <w:t>Table 3.1: Dashboard UI component summary in `src/main.py`.</w:t>
+        <w:t>Table 3.1: Dashboard UI component summary in `src/dashboard.py`.</w:t>
       </w:r>
     </w:p>
     <w:p>

</xml_diff>

<commit_message>
Update docs, README, spec, and assets for background service toggle, custom icons, and macOS Launch Services caching
</commit_message>
<xml_diff>
--- a/docs/System_Resource_Optimizer_Documentation.docx
+++ b/docs/System_Resource_Optimizer_Documentation.docx
@@ -11660,6 +11660,394 @@
           <w:rFonts w:ascii="Arial" w:hAnsi="Arial"/>
         </w:rPr>
         <w:t>Silberschatz, A., Galvin, P. B., &amp; Gagne, G. (2018). Operating System Concepts (10th ed.). Wiley.</w:t>
+      </w:r>
+    </w:p>
+    <w:p>
+      <w:pPr>
+        <w:pStyle w:val="Heading2"/>
+      </w:pPr>
+      <w:r>
+        <w:rPr>
+          <w:rFonts w:ascii="Arial" w:hAnsi="Arial"/>
+          <w:b/>
+          <w:sz w:val="26"/>
+        </w:rPr>
+        <w:t>Appendix F: Decoupled Background Daemon &amp; Universal Icon Integration</w:t>
+      </w:r>
+    </w:p>
+    <w:p>
+      <w:pPr/>
+      <w:r>
+        <w:rPr>
+          <w:rFonts w:ascii="Arial" w:hAnsi="Arial"/>
+          <w:sz w:val="22"/>
+        </w:rPr>
+        <w:t>1. IPC Background Daemon: The SRO application uses a client-server local IPC architecture (port 5050). The background service daemon executes the real-time telemetry collection and PyTorch GRU model inference, enabling it to run continuously in the background. On macOS, this daemon is compiled as a CLI binary (console=True) so it runs silently without registering a duplicate Dock icon. On Windows, it runs without a console window.</w:t>
+      </w:r>
+    </w:p>
+    <w:p>
+      <w:pPr/>
+      <w:r>
+        <w:rPr>
+          <w:rFonts w:ascii="Arial" w:hAnsi="Arial"/>
+          <w:sz w:val="22"/>
+        </w:rPr>
+        <w:t>2. Background Optimizer Engine Toggle: A toggle switch in the Settings tab allows the user to suspend/resume the active optimizer telemetry and inference thread via IPC. Disabling it resumes all suspended tasks and triggers a notification while maintaining the IPC connection.</w:t>
+      </w:r>
+    </w:p>
+    <w:p>
+      <w:pPr/>
+      <w:r>
+        <w:rPr>
+          <w:rFonts w:ascii="Arial" w:hAnsi="Arial"/>
+          <w:sz w:val="22"/>
+        </w:rPr>
+        <w:t>3. Universal Icon System: The custom gradient logo (optimization arrow wrapping a microchip core) is natively integrated in PNG, SVG, ICNS (macOS), and ICO (Windows) formats. In the PyInstaller build specification, LSBackgroundOnly is set to False in Info.plist to ensure macOS registers the GUI client in the Dock and processes standard user notifications.</w:t>
+      </w:r>
+    </w:p>
+    <w:p>
+      <w:pPr/>
+      <w:r>
+        <w:rPr>
+          <w:rFonts w:ascii="Arial" w:hAnsi="Arial"/>
+          <w:sz w:val="22"/>
+        </w:rPr>
+        <w:t>4. Clean Shutdown Sequence: Stopping the background service from the Settings GUI sends a 'shutdown' signal to the IPC socket. The service resumes all suspended tasks, posts a desktop alert, and then exits, after which the GUI client closes its window.</w:t>
+      </w:r>
+    </w:p>
+    <w:p>
+      <w:pPr>
+        <w:pStyle w:val="Heading2"/>
+      </w:pPr>
+      <w:r>
+        <w:rPr>
+          <w:rFonts w:ascii="Arial" w:hAnsi="Arial"/>
+          <w:b/>
+          <w:sz w:val="26"/>
+        </w:rPr>
+        <w:t>Appendix G: macOS Dock Icon Caching &amp; Notification Icon Attributes</w:t>
+      </w:r>
+    </w:p>
+    <w:p>
+      <w:pPr/>
+      <w:r>
+        <w:rPr>
+          <w:rFonts w:ascii="Arial" w:hAnsi="Arial"/>
+          <w:sz w:val="22"/>
+        </w:rPr>
+        <w:t>1. macOS Launch Services Icon Cache: When compiling desktop applications with PyInstaller and Flet on macOS, the OS registers the application bundle identifier in Launch Services. Icon changes may not reflect immediately in the Dock if the cache is active. Relocating, renaming the app, or resetting the Dock process clears the cache.</w:t>
+      </w:r>
+    </w:p>
+    <w:p>
+      <w:pPr/>
+      <w:r>
+        <w:rPr>
+          <w:rFonts w:ascii="Arial" w:hAnsi="Arial"/>
+          <w:sz w:val="22"/>
+        </w:rPr>
+        <w:t>2. AppleScript Notification Context: Desktop alerts on macOS are routed via shell-based osascript. This executes outside the Cocoa app bundle context, causing the OS to attribute the notification banner to the Script Editor application icon rather than the custom optimizer logo. On Windows, the icon is successfully customized by passing the absolute path of the generated icon.ico file to the Windows notification tray API.</w:t>
+      </w:r>
+    </w:p>
+    <w:p>
+      <w:pPr>
+        <w:pStyle w:val="Heading2"/>
+      </w:pPr>
+      <w:r>
+        <w:rPr>
+          <w:rFonts w:ascii="Arial" w:hAnsi="Arial"/>
+          <w:b/>
+          <w:sz w:val="26"/>
+        </w:rPr>
+        <w:t>Kernel Thread Protection &amp; Thread-Safe UI Interception</w:t>
+      </w:r>
+    </w:p>
+    <w:p>
+      <w:pPr/>
+      <w:r>
+        <w:rPr>
+          <w:rFonts w:ascii="Arial" w:hAnsi="Arial"/>
+          <w:sz w:val="22"/>
+        </w:rPr>
+        <w:t>The SRO prevents UI freezes by intercepting runaway processes before they can starve the Windows kernel's interrupt handlers and compositor threads. When the GRU model predicts a bottleneck with ≥80% confidence, the Action Engine either:</w:t>
+        <w:br/>
+        <w:t xml:space="preserve">  - Suspends the process entirely (SIGSTOP / NtSuspendThread), or</w:t>
+        <w:br/>
+        <w:t xml:space="preserve">  - On supported systems, isolates the heavy task to efficiency cores (macOS) or removes its access to Core 0/1 (Windows).</w:t>
+        <w:br/>
+        <w:t>This ensures that critical UI threads (explorer.exe, dwm.exe, csrss.exe) always receive CPU time, eliminating the 'Not Responding' experience.</w:t>
+      </w:r>
+    </w:p>
+    <w:p>
+      <w:pPr>
+        <w:pStyle w:val="Heading2"/>
+      </w:pPr>
+      <w:r>
+        <w:rPr>
+          <w:rFonts w:ascii="Arial" w:hAnsi="Arial"/>
+          <w:b/>
+          <w:sz w:val="26"/>
+        </w:rPr>
+        <w:t>Elite User Experience &amp; Help System</w:t>
+      </w:r>
+    </w:p>
+    <w:p>
+      <w:pPr/>
+      <w:r>
+        <w:rPr>
+          <w:rFonts w:ascii="Arial" w:hAnsi="Arial"/>
+          <w:sz w:val="22"/>
+        </w:rPr>
+        <w:t>To ensure high user accessibility and low cognitive friction, the system implements an multi-tiered, in-app documentation framework described below:</w:t>
+      </w:r>
+    </w:p>
+    <w:tbl>
+      <w:tblPr>
+        <w:tblStyle w:val="TableGrid"/>
+        <w:tblW w:type="auto" w:w="0"/>
+        <w:tblLook w:firstColumn="1" w:firstRow="1" w:lastColumn="0" w:lastRow="0" w:noHBand="0" w:noVBand="1" w:val="04A0"/>
+      </w:tblPr>
+      <w:tblGrid>
+        <w:gridCol w:w="3120"/>
+        <w:gridCol w:w="3120"/>
+        <w:gridCol w:w="3120"/>
+      </w:tblGrid>
+      <w:tr>
+        <w:tc>
+          <w:tcPr>
+            <w:tcW w:type="dxa" w:w="3120"/>
+          </w:tcPr>
+          <w:p>
+            <w:r>
+              <w:rPr>
+                <w:rFonts w:ascii="Arial" w:hAnsi="Arial"/>
+                <w:b/>
+                <w:sz w:val="22"/>
+              </w:rPr>
+              <w:t>Format</w:t>
+            </w:r>
+          </w:p>
+        </w:tc>
+        <w:tc>
+          <w:tcPr>
+            <w:tcW w:type="dxa" w:w="3120"/>
+          </w:tcPr>
+          <w:p>
+            <w:r>
+              <w:rPr>
+                <w:rFonts w:ascii="Arial" w:hAnsi="Arial"/>
+                <w:b/>
+                <w:sz w:val="22"/>
+              </w:rPr>
+              <w:t>Where</w:t>
+            </w:r>
+          </w:p>
+        </w:tc>
+        <w:tc>
+          <w:tcPr>
+            <w:tcW w:type="dxa" w:w="3120"/>
+          </w:tcPr>
+          <w:p>
+            <w:r>
+              <w:rPr>
+                <w:rFonts w:ascii="Arial" w:hAnsi="Arial"/>
+                <w:b/>
+                <w:sz w:val="22"/>
+              </w:rPr>
+              <w:t>Content</w:t>
+            </w:r>
+          </w:p>
+        </w:tc>
+      </w:tr>
+      <w:tr>
+        <w:tc>
+          <w:tcPr>
+            <w:tcW w:type="dxa" w:w="3120"/>
+          </w:tcPr>
+          <w:p>
+            <w:r>
+              <w:rPr>
+                <w:rFonts w:ascii="Arial" w:hAnsi="Arial"/>
+                <w:sz w:val="20"/>
+              </w:rPr>
+              <w:t>Tooltips</w:t>
+            </w:r>
+          </w:p>
+        </w:tc>
+        <w:tc>
+          <w:tcPr>
+            <w:tcW w:type="dxa" w:w="3120"/>
+          </w:tcPr>
+          <w:p>
+            <w:r>
+              <w:rPr>
+                <w:rFonts w:ascii="Arial" w:hAnsi="Arial"/>
+                <w:sz w:val="20"/>
+              </w:rPr>
+              <w:t>Hover over any UI element (ⓘ icon)</w:t>
+            </w:r>
+          </w:p>
+        </w:tc>
+        <w:tc>
+          <w:tcPr>
+            <w:tcW w:type="dxa" w:w="3120"/>
+          </w:tcPr>
+          <w:p>
+            <w:r>
+              <w:rPr>
+                <w:rFonts w:ascii="Arial" w:hAnsi="Arial"/>
+                <w:sz w:val="20"/>
+              </w:rPr>
+              <w:t>1-sentence explanation</w:t>
+            </w:r>
+          </w:p>
+        </w:tc>
+      </w:tr>
+      <w:tr>
+        <w:tc>
+          <w:tcPr>
+            <w:tcW w:type="dxa" w:w="3120"/>
+          </w:tcPr>
+          <w:p>
+            <w:r>
+              <w:rPr>
+                <w:rFonts w:ascii="Arial" w:hAnsi="Arial"/>
+                <w:sz w:val="20"/>
+              </w:rPr>
+              <w:t>Quick Start Guide (1 page PDF)</w:t>
+            </w:r>
+          </w:p>
+        </w:tc>
+        <w:tc>
+          <w:tcPr>
+            <w:tcW w:type="dxa" w:w="3120"/>
+          </w:tcPr>
+          <w:p>
+            <w:r>
+              <w:rPr>
+                <w:rFonts w:ascii="Arial" w:hAnsi="Arial"/>
+                <w:sz w:val="20"/>
+              </w:rPr>
+              <w:t>In the installer folder or Help menu</w:t>
+            </w:r>
+          </w:p>
+        </w:tc>
+        <w:tc>
+          <w:tcPr>
+            <w:tcW w:type="dxa" w:w="3120"/>
+          </w:tcPr>
+          <w:p>
+            <w:r>
+              <w:rPr>
+                <w:rFonts w:ascii="Arial" w:hAnsi="Arial"/>
+                <w:sz w:val="20"/>
+              </w:rPr>
+              <w:t>5 steps: Install → Launch → Wait 60s → Toggle Auto-Pilot → Done</w:t>
+            </w:r>
+          </w:p>
+        </w:tc>
+      </w:tr>
+      <w:tr>
+        <w:tc>
+          <w:tcPr>
+            <w:tcW w:type="dxa" w:w="3120"/>
+          </w:tcPr>
+          <w:p>
+            <w:r>
+              <w:rPr>
+                <w:rFonts w:ascii="Arial" w:hAnsi="Arial"/>
+                <w:sz w:val="20"/>
+              </w:rPr>
+              <w:t>In-app "Help" sidebar</w:t>
+            </w:r>
+          </w:p>
+        </w:tc>
+        <w:tc>
+          <w:tcPr>
+            <w:tcW w:type="dxa" w:w="3120"/>
+          </w:tcPr>
+          <w:p>
+            <w:r>
+              <w:rPr>
+                <w:rFonts w:ascii="Arial" w:hAnsi="Arial"/>
+                <w:sz w:val="20"/>
+              </w:rPr>
+              <w:t>Click ❔ icon, slides out from right</w:t>
+            </w:r>
+          </w:p>
+        </w:tc>
+        <w:tc>
+          <w:tcPr>
+            <w:tcW w:type="dxa" w:w="3120"/>
+          </w:tcPr>
+          <w:p>
+            <w:r>
+              <w:rPr>
+                <w:rFonts w:ascii="Arial" w:hAnsi="Arial"/>
+                <w:sz w:val="20"/>
+              </w:rPr>
+              <w:t>FAQ: Why suspend not kill? What is whitelist? How to restore?</w:t>
+            </w:r>
+          </w:p>
+        </w:tc>
+      </w:tr>
+      <w:tr>
+        <w:tc>
+          <w:tcPr>
+            <w:tcW w:type="dxa" w:w="3120"/>
+          </w:tcPr>
+          <w:p>
+            <w:r>
+              <w:rPr>
+                <w:rFonts w:ascii="Arial" w:hAnsi="Arial"/>
+                <w:sz w:val="20"/>
+              </w:rPr>
+              <w:t>Video demo link</w:t>
+            </w:r>
+          </w:p>
+        </w:tc>
+        <w:tc>
+          <w:tcPr>
+            <w:tcW w:type="dxa" w:w="3120"/>
+          </w:tcPr>
+          <w:p>
+            <w:r>
+              <w:rPr>
+                <w:rFonts w:ascii="Arial" w:hAnsi="Arial"/>
+                <w:sz w:val="20"/>
+              </w:rPr>
+              <w:t>Help menu → "Watch 1-min demo"</w:t>
+            </w:r>
+          </w:p>
+        </w:tc>
+        <w:tc>
+          <w:tcPr>
+            <w:tcW w:type="dxa" w:w="3120"/>
+          </w:tcPr>
+          <w:p>
+            <w:r>
+              <w:rPr>
+                <w:rFonts w:ascii="Arial" w:hAnsi="Arial"/>
+                <w:sz w:val="20"/>
+              </w:rPr>
+              <w:t>YouTube unlisted or local MP4 (show live responsiveness)</w:t>
+            </w:r>
+          </w:p>
+        </w:tc>
+      </w:tr>
+    </w:tbl>
+    <w:p>
+      <w:pPr/>
+    </w:p>
+    <w:p>
+      <w:pPr/>
+      <w:r>
+        <w:rPr>
+          <w:rFonts w:ascii="Arial" w:hAnsi="Arial"/>
+          <w:b/>
+          <w:i/>
+          <w:sz w:val="22"/>
+        </w:rPr>
+        <w:t>Do NOT force the user to read a 20-page document. That is the opposite of an ‘elite’ user experience.</w:t>
       </w:r>
     </w:p>
     <w:sectPr>

</xml_diff>

<commit_message>
docs: update system documentation docx files with background service toggle and macOS notification instant-delivery changes
</commit_message>
<xml_diff>
--- a/docs/System_Resource_Optimizer_Documentation.docx
+++ b/docs/System_Resource_Optimizer_Documentation.docx
@@ -11688,11 +11688,7 @@
     <w:p>
       <w:pPr/>
       <w:r>
-        <w:rPr>
-          <w:rFonts w:ascii="Arial" w:hAnsi="Arial"/>
-          <w:sz w:val="22"/>
-        </w:rPr>
-        <w:t>2. Background Optimizer Engine Toggle: A toggle switch in the Settings tab allows the user to suspend/resume the active optimizer telemetry and inference thread via IPC. Disabling it resumes all suspended tasks and triggers a notification while maintaining the IPC connection.</w:t>
+        <w:t>2. Background Optimizer Engine Toggle: A toggle switch in the Settings tab allows the user to suspend/resume the active optimizer telemetry and inference thread via IPC. Disabling it resumes all suspended tasks and triggers an instant notification while maintaining the IPC connection. Re-enabling it cleanly restarts the telemetry pipeline loop and reactivates the Action Engine's auto-resume watchdog thread.</w:t>
       </w:r>
     </w:p>
     <w:p>
@@ -11741,11 +11737,7 @@
     <w:p>
       <w:pPr/>
       <w:r>
-        <w:rPr>
-          <w:rFonts w:ascii="Arial" w:hAnsi="Arial"/>
-          <w:sz w:val="22"/>
-        </w:rPr>
-        <w:t>2. AppleScript Notification Context: Desktop alerts on macOS are routed via shell-based osascript. This executes outside the Cocoa app bundle context, causing the OS to attribute the notification banner to the Script Editor application icon rather than the custom optimizer logo. On Windows, the icon is successfully customized by passing the absolute path of the generated icon.ico file to the Windows notification tray API.</w:t>
+        <w:t>2. AppleScript Notification Context: Desktop alerts on macOS are routed via shell-based osascript. To prevent LaunchServices lookup delays (which can cause delivery hangs of up to 5 minutes when the GUI is open or closed), the notifications are sent directly via the AppleScript 'display notification' command without application targeting tell blocks. This ensures instant delivery, though macOS attributes the notification banner to the osascript system interpreter icon. On Windows, the icon is successfully customized by passing the absolute path of the generated icon.ico file to the Windows notification tray API.</w:t>
       </w:r>
     </w:p>
     <w:p>

</xml_diff>